<commit_message>
Session 58: Divergence Alert tags accepted (7 signals) + Williams v2.3 confirmed
Co-Authored-By: Claude Sonnet 4.6 <noreply@anthropic.com>
</commit_message>
<xml_diff>
--- a/draftos/docs/apex/archetype_library/DraftOS_Position_CB.docx
+++ b/draftos/docs/apex/archetype_library/DraftOS_Position_CB.docx
@@ -6150,7 +6150,7 @@
                 <w:sz w:val="18"/>
                 <w:szCs w:val="18"/>
               </w:rPr>
-              <w:t xml:space="preserve">CHRIS HARRIS JR. (the mechanism standard): Elite technique and processing in condensed space — made elite quarterbacks reconsider slot routes in his prime. Undersized by any standard metric; won through hand fighting and processing. Proves the archetype does not require size or elite athleticism if technique and processing are genuine. | NICKELL ROBEY-COLEMAN (scheme value proof): Modest measurables, outsized positional impact — confirms that the market consistently undervalues this archetype because the combine does not measure the traits that make it work. | RONDE BARBER (developmental aspiration): Began as a zone technician, developed slot/nickel-specific skills into a long career as one of the most complete slot defenders of his era. The ceiling of what sustained development in this archetype produces. | TROY HILL (floor expression): Functional slot starter who maximized limited physical tools through processing and positioning — confirms the archetype has a reliable floor even without elite athleticism.</w:t>
+              <w:t xml:space="preserve">CHRIS HARRIS JR. (the mechanism standard): Elite technique and processing in condensed space — made elite quarterbacks reconsider slot routes in his prime. Undersized by any standard metric; won through hand fighting and processing. Proves the archetype does not require size or elite athleticism if technique and processing are genuine. | NICKELL ROBEY-COLEMAN (scheme value proof): Modest measurables, outsized positional impact — confirms that the market consistently undervalues this archetype because the combine does not measure the traits that make it work. | TRE’DAVIOUS WHITE (developmental ceiling): Entered as a slot-plus technician at LSU, deployed primarily at boundary corner in the NFL — the same pattern-matching and anticipatory processing that defines CB-4 in condensed space transferred to outside alignment when processing is elite enough. All-Pro 2019 confirms the archetype’s highest expression is not slot-limited. Proves that CB-4 processing at elite level produces boundary-CB outcomes. | TROY HILL (floor expression): Functional slot starter who maximized limited physical tools through processing and positioning — confirms the archetype has a reliable floor even without elite athleticism.</w:t>
             </w:r>
           </w:p>
         </w:tc>
@@ -10639,7 +10639,7 @@
                 <w:sz w:val="18"/>
                 <w:szCs w:val="18"/>
               </w:rPr>
-              <w:t xml:space="preserve">FM-1 (Athleticism Mirage) primary + FM-4 (Body Breakdown) compounding. PAA Q3 fires: production was heavily scheme-supported at Ohio State — bracket coverage and zone rotations reduced true man-coverage exposure. A deeper film audit against future NFL receivers would have shown the coverage grade dropping materially. PAA Q4 fires: processing was reactive in the limited true man-coverage reps available — post-break recovery was the dominant mode, not pre-break anticipation. Pre-draft vector scores should have been: Athleticism 8/10, Processing 5/10 (PAA Q4 cap at 6/10 activated), Production 6/10 (PAA Q3 scheme context discount), Scheme Versatility 4/10 (single-system producer). Soft tissue injury history (hamstring) should have activated FM-4 monitoring with Injury &amp; Durability discounted to 5/10 and flagged as compounding risk with FB-1. Overall grade should have been Day 2 — Round 2, not Round 1, Pick 24.</w:t>
+              <w:t xml:space="preserve">FM-1 (Athleticism Mirage) primary + FM-4 (Body Breakdown) compounding. PAA Q3 fires: production was heavily scheme-supported at Ohio State — bracket coverage and zone rotations reduced true man-coverage exposure. A deeper film audit against future NFL receivers would have shown the coverage grade dropping materially. PAA Q4 fires: processing was reactive in the limited true man-coverage reps available — post-break recovery was the dominant mode, not pre-break anticipation. Pre-draft vector scores should have been: Athleticism 8/10, Processing 5/10 (PAA Q4 cap at 6/10 activated), Production 6/10 (PAA Q3 scheme context discount), Scheme Versatility 4/10 (single-system producer). Soft tissue injury history (hamstring) should have activated FM-4 monitoring with Injury &amp; Durability discounted to 5/10 and flagged as compounding risk with FM-1. Overall grade should have been Day 2 — Round 2, not Round 1, Pick 24.</w:t>
             </w:r>
           </w:p>
         </w:tc>

</xml_diff>